<commit_message>
gitlab đăng ký từ unregisted file
</commit_message>
<xml_diff>
--- a/C 5 .docx
+++ b/C 5 .docx
@@ -10,13 +10,7 @@
         <w:t>A ABO_0001</w:t>
       </w:r>
       <w:r>
-        <w:t>_123456</w:t>
-      </w:r>
-      <w:r>
-        <w:t>update</w:t>
-      </w:r>
-      <w:r>
-        <w:t xml:space="preserve"> trên reo00000</w:t>
+        <w:t>_test002</w:t>
       </w:r>
     </w:p>
     <w:p>

</xml_diff>